<commit_message>
Fix Linux runtime libraries and CNN checkpoint loading
- MediaPipe's Linux build loads libEGL/libGLES even on the CPU: add
  libegl1 and libgles2 to the Docker image and the CI workflow (the
  first CI run failed on exactly this; the deployed site would have too).
- Save the CNN's metadata as plain JSON values so the checkpoint loads
  with torch.load(weights_only=True); add a save/reload test.
- Read the training loss with .item().

Co-Authored-By: Claude Opus 5.5 <noreply@anthropic.com>
</commit_message>
<xml_diff>
--- a/docs/PulseCheck_Technical_Report.docx
+++ b/docs/PulseCheck_Technical_Report.docx
@@ -3579,7 +3579,7 @@
     <w:p>
       <w:r>
         <w:rPr/>
-        <w:t>A Dockerfile builds on python:3.14-slim, adds the shared libraries OpenCV and MediaPipe need (libgl1, libglib2.0-0, libportaudio2), installs the pinned requirements as a non-root user with uid 1000 (as Hugging Face requires), downloads and checksum-verifies the face model, and starts Uvicorn on port 7860 with a health check. The README front matter (sdk: docker, app_port: 7860) configures the Hugging Face Space, and the Hugging Face CLI uploads the project (it stores binary files with Xet automatically). Training always happens on the laptop; only the trained model files are uploaded.</w:t>
+        <w:t>A Dockerfile builds on python:3.14-slim, adds the shared libraries OpenCV and MediaPipe need (libgl1, libglib2.0-0, libegl1, libgles2, libportaudio2), installs the pinned requirements as a non-root user with uid 1000 (as Hugging Face requires), downloads and checksum-verifies the face model, and starts Uvicorn on port 7860 with a health check. The README front matter (sdk: docker, app_port: 7860) configures the Hugging Face Space, and the Hugging Face CLI uploads the project (it stores binary files with Xet automatically). Training always happens on the laptop; only the trained model files are uploaded.</w:t>
       </w:r>
     </w:p>
     <w:p>
@@ -3816,7 +3816,7 @@
     <w:p>
       <w:r>
         <w:rPr/>
-        <w:t>The repository has 40 automated test functions (pytest) in 8 files. They check the code against answers known in advance: the article's worked example (300 samples, step 12, 72 bpm), heart-rate recovery at off-bin rates, filter behaviour, all three rPPG methods (including the lamp-flicker case), coherence and features, the dataset loaders on miniature folder trees laid out like the official downloads, the metrics against hand-computed values, the web API end to end, and the CNN on a learnable toy task.</w:t>
+        <w:t>The repository has 41 automated test functions (pytest) in 8 files. They check the code against answers known in advance: the article's worked example (300 samples, step 12, 72 bpm), heart-rate recovery at off-bin rates, filter behaviour, all three rPPG methods (including the lamp-flicker case), coherence and features, the dataset loaders on miniature folder trees laid out like the official downloads, the metrics against hand-computed values, the web API end to end, and the CNN on a learnable toy task.</w:t>
       </w:r>
     </w:p>
     <w:tbl>
@@ -4273,7 +4273,7 @@
               <w:rPr>
                 <w:sz w:val="18"/>
               </w:rPr>
-              <w:t>not installed</w:t>
+              <w:t>2.14.1+cu126</w:t>
             </w:r>
           </w:p>
         </w:tc>

</xml_diff>